<commit_message>
feat(patent): revised draft (red-marked) + fit-to-page drawings
- ACN1408_CAP_Draft_REVISED.docx: provisional spec with reconciliation corrections and the
  AI framework/model explanation + Figure 2-5 descriptions inserted, all in RED so the
  supervisor sees every change/addition (edit_draft.py).
- Drawings_ACN1408_CAP.docx: each figure now sized to fit its A4 sheet (constrained by
  width AND height) so figures no longer overflow / overlap on the page.
</commit_message>
<xml_diff>
--- a/patent_cap/Drawings_ACN1408_CAP.docx
+++ b/patent_cap/Drawings_ACN1408_CAP.docx
@@ -29,7 +29,7 @@
       <w:r>
         <w:drawing>
           <wp:inline xmlns:a="http://schemas.openxmlformats.org/drawingml/2006/main" xmlns:pic="http://schemas.openxmlformats.org/drawingml/2006/picture">
-            <wp:extent cx="5760720" cy="5610506"/>
+            <wp:extent cx="5852160" cy="5699561"/>
             <wp:docPr id="1" name="Picture 1"/>
             <wp:cNvGraphicFramePr>
               <a:graphicFrameLocks noChangeAspect="1"/>
@@ -50,7 +50,7 @@
                   <pic:spPr>
                     <a:xfrm>
                       <a:off x="0" y="0"/>
-                      <a:ext cx="5760720" cy="5610506"/>
+                      <a:ext cx="5852160" cy="5699561"/>
                     </a:xfrm>
                     <a:prstGeom prst="rect"/>
                   </pic:spPr>
@@ -93,7 +93,7 @@
       <w:r>
         <w:drawing>
           <wp:inline xmlns:a="http://schemas.openxmlformats.org/drawingml/2006/main" xmlns:pic="http://schemas.openxmlformats.org/drawingml/2006/picture">
-            <wp:extent cx="5760720" cy="4714955"/>
+            <wp:extent cx="5852160" cy="4789796"/>
             <wp:docPr id="2" name="Picture 2"/>
             <wp:cNvGraphicFramePr>
               <a:graphicFrameLocks noChangeAspect="1"/>
@@ -114,7 +114,7 @@
                   <pic:spPr>
                     <a:xfrm>
                       <a:off x="0" y="0"/>
-                      <a:ext cx="5760720" cy="4714955"/>
+                      <a:ext cx="5852160" cy="4789796"/>
                     </a:xfrm>
                     <a:prstGeom prst="rect"/>
                   </pic:spPr>
@@ -157,7 +157,7 @@
       <w:r>
         <w:drawing>
           <wp:inline xmlns:a="http://schemas.openxmlformats.org/drawingml/2006/main" xmlns:pic="http://schemas.openxmlformats.org/drawingml/2006/picture">
-            <wp:extent cx="5760720" cy="5760720"/>
+            <wp:extent cx="5852160" cy="5852160"/>
             <wp:docPr id="3" name="Picture 3"/>
             <wp:cNvGraphicFramePr>
               <a:graphicFrameLocks noChangeAspect="1"/>
@@ -178,7 +178,7 @@
                   <pic:spPr>
                     <a:xfrm>
                       <a:off x="0" y="0"/>
-                      <a:ext cx="5760720" cy="5760720"/>
+                      <a:ext cx="5852160" cy="5852160"/>
                     </a:xfrm>
                     <a:prstGeom prst="rect"/>
                   </pic:spPr>
@@ -221,7 +221,7 @@
       <w:r>
         <w:drawing>
           <wp:inline xmlns:a="http://schemas.openxmlformats.org/drawingml/2006/main" xmlns:pic="http://schemas.openxmlformats.org/drawingml/2006/picture">
-            <wp:extent cx="5760720" cy="5811753"/>
+            <wp:extent cx="5852160" cy="5904003"/>
             <wp:docPr id="4" name="Picture 4"/>
             <wp:cNvGraphicFramePr>
               <a:graphicFrameLocks noChangeAspect="1"/>
@@ -242,7 +242,7 @@
                   <pic:spPr>
                     <a:xfrm>
                       <a:off x="0" y="0"/>
-                      <a:ext cx="5760720" cy="5811753"/>
+                      <a:ext cx="5852160" cy="5904003"/>
                     </a:xfrm>
                     <a:prstGeom prst="rect"/>
                   </pic:spPr>
@@ -285,7 +285,7 @@
       <w:r>
         <w:drawing>
           <wp:inline xmlns:a="http://schemas.openxmlformats.org/drawingml/2006/main" xmlns:pic="http://schemas.openxmlformats.org/drawingml/2006/picture">
-            <wp:extent cx="5760720" cy="5760720"/>
+            <wp:extent cx="5852160" cy="5852160"/>
             <wp:docPr id="5" name="Picture 5"/>
             <wp:cNvGraphicFramePr>
               <a:graphicFrameLocks noChangeAspect="1"/>
@@ -306,7 +306,7 @@
                   <pic:spPr>
                     <a:xfrm>
                       <a:off x="0" y="0"/>
-                      <a:ext cx="5760720" cy="5760720"/>
+                      <a:ext cx="5852160" cy="5852160"/>
                     </a:xfrm>
                     <a:prstGeom prst="rect"/>
                   </pic:spPr>

</xml_diff>

<commit_message>
feat(patent): redraw all 5 figures with Mermaid (library, not hand-drawn)
Patent agent flagged the matplotlib figures as AI/hand-drawn. Redraw all five as standard
Mermaid diagrams (flowchart, sequenceDiagram, stateDiagram-v2), themed pure black-on-white
(no colour, no shading, notes/clusters white) with reference numerals in labels. Render to
high-res PNG + vector SVG; rebuild Drawings_ACN1408_CAP.docx from the Mermaid PNGs, each
figure fit to its A4 sheet. Mermaid source (.mmd) kept for reproducibility/edits.
</commit_message>
<xml_diff>
--- a/patent_cap/Drawings_ACN1408_CAP.docx
+++ b/patent_cap/Drawings_ACN1408_CAP.docx
@@ -29,7 +29,7 @@
       <w:r>
         <w:drawing>
           <wp:inline xmlns:a="http://schemas.openxmlformats.org/drawingml/2006/main" xmlns:pic="http://schemas.openxmlformats.org/drawingml/2006/picture">
-            <wp:extent cx="5852160" cy="5699561"/>
+            <wp:extent cx="5852160" cy="1097280"/>
             <wp:docPr id="1" name="Picture 1"/>
             <wp:cNvGraphicFramePr>
               <a:graphicFrameLocks noChangeAspect="1"/>
@@ -50,7 +50,7 @@
                   <pic:spPr>
                     <a:xfrm>
                       <a:off x="0" y="0"/>
-                      <a:ext cx="5852160" cy="5699561"/>
+                      <a:ext cx="5852160" cy="1097280"/>
                     </a:xfrm>
                     <a:prstGeom prst="rect"/>
                   </pic:spPr>
@@ -93,7 +93,7 @@
       <w:r>
         <w:drawing>
           <wp:inline xmlns:a="http://schemas.openxmlformats.org/drawingml/2006/main" xmlns:pic="http://schemas.openxmlformats.org/drawingml/2006/picture">
-            <wp:extent cx="5852160" cy="4789796"/>
+            <wp:extent cx="5852160" cy="3590420"/>
             <wp:docPr id="2" name="Picture 2"/>
             <wp:cNvGraphicFramePr>
               <a:graphicFrameLocks noChangeAspect="1"/>
@@ -114,7 +114,7 @@
                   <pic:spPr>
                     <a:xfrm>
                       <a:off x="0" y="0"/>
-                      <a:ext cx="5852160" cy="4789796"/>
+                      <a:ext cx="5852160" cy="3590420"/>
                     </a:xfrm>
                     <a:prstGeom prst="rect"/>
                   </pic:spPr>
@@ -157,7 +157,7 @@
       <w:r>
         <w:drawing>
           <wp:inline xmlns:a="http://schemas.openxmlformats.org/drawingml/2006/main" xmlns:pic="http://schemas.openxmlformats.org/drawingml/2006/picture">
-            <wp:extent cx="5852160" cy="5852160"/>
+            <wp:extent cx="4886529" cy="7132319"/>
             <wp:docPr id="3" name="Picture 3"/>
             <wp:cNvGraphicFramePr>
               <a:graphicFrameLocks noChangeAspect="1"/>
@@ -178,7 +178,7 @@
                   <pic:spPr>
                     <a:xfrm>
                       <a:off x="0" y="0"/>
-                      <a:ext cx="5852160" cy="5852160"/>
+                      <a:ext cx="4886529" cy="7132319"/>
                     </a:xfrm>
                     <a:prstGeom prst="rect"/>
                   </pic:spPr>
@@ -221,7 +221,7 @@
       <w:r>
         <w:drawing>
           <wp:inline xmlns:a="http://schemas.openxmlformats.org/drawingml/2006/main" xmlns:pic="http://schemas.openxmlformats.org/drawingml/2006/picture">
-            <wp:extent cx="5852160" cy="5904003"/>
+            <wp:extent cx="1941074" cy="7132318"/>
             <wp:docPr id="4" name="Picture 4"/>
             <wp:cNvGraphicFramePr>
               <a:graphicFrameLocks noChangeAspect="1"/>
@@ -242,7 +242,7 @@
                   <pic:spPr>
                     <a:xfrm>
                       <a:off x="0" y="0"/>
-                      <a:ext cx="5852160" cy="5904003"/>
+                      <a:ext cx="1941074" cy="7132318"/>
                     </a:xfrm>
                     <a:prstGeom prst="rect"/>
                   </pic:spPr>
@@ -285,7 +285,7 @@
       <w:r>
         <w:drawing>
           <wp:inline xmlns:a="http://schemas.openxmlformats.org/drawingml/2006/main" xmlns:pic="http://schemas.openxmlformats.org/drawingml/2006/picture">
-            <wp:extent cx="5852160" cy="5852160"/>
+            <wp:extent cx="5852160" cy="2492587"/>
             <wp:docPr id="5" name="Picture 5"/>
             <wp:cNvGraphicFramePr>
               <a:graphicFrameLocks noChangeAspect="1"/>
@@ -306,7 +306,7 @@
                   <pic:spPr>
                     <a:xfrm>
                       <a:off x="0" y="0"/>
-                      <a:ext cx="5852160" cy="5852160"/>
+                      <a:ext cx="5852160" cy="2492587"/>
                     </a:xfrm>
                     <a:prstGeom prst="rect"/>
                   </pic:spPr>

</xml_diff>

<commit_message>
fix(patent): Figure 5 label overlap — short edge labels + conditions in a note
The BLOCKED<->ALLOWED transition labels overlapped onto the white area. Replace with short
'permit'/'revoke' edge labels and move the full allow/revoke conditions into a (white) note,
eliminating the overlap. Rebuild Drawings_ACN1408_CAP.docx.
</commit_message>
<xml_diff>
--- a/patent_cap/Drawings_ACN1408_CAP.docx
+++ b/patent_cap/Drawings_ACN1408_CAP.docx
@@ -285,7 +285,7 @@
       <w:r>
         <w:drawing>
           <wp:inline xmlns:a="http://schemas.openxmlformats.org/drawingml/2006/main" xmlns:pic="http://schemas.openxmlformats.org/drawingml/2006/picture">
-            <wp:extent cx="5852160" cy="2492587"/>
+            <wp:extent cx="5852160" cy="4655315"/>
             <wp:docPr id="5" name="Picture 5"/>
             <wp:cNvGraphicFramePr>
               <a:graphicFrameLocks noChangeAspect="1"/>
@@ -306,7 +306,7 @@
                   <pic:spPr>
                     <a:xfrm>
                       <a:off x="0" y="0"/>
-                      <a:ext cx="5852160" cy="2492587"/>
+                      <a:ext cx="5852160" cy="4655315"/>
                     </a:xfrm>
                     <a:prstGeom prst="rect"/>
                   </pic:spPr>

</xml_diff>